<commit_message>
fix(shipping): resolve critical carrier assignment issue for shipping labels
- Addressed a critical bug (BUG-025) where incorrect carrier assignments were made for shipping labels based on order weight.
- Updated `calculateOrderWeight` to prioritize order-level weight over item weights, ensuring accurate weight calculations.
- Enhanced `matchCarrierRule` with type-safe comparisons to prevent issues with string-based weight values.
- Implemented numerical normalization for carrier rules during storage to ensure consistent data types in Firestore.
- Added detailed documentation in TASKS.md outlining the root causes and fixes for better clarity and future reference.
</commit_message>
<xml_diff>
--- a/AvyCloud_Analyse_Marktbewertung.docx
+++ b/AvyCloud_Analyse_Marktbewertung.docx
@@ -319,7 +319,7 @@
           <w:sz w:val="22"/>
           <w:szCs w:val="22"/>
         </w:rPr>
-        <w:t xml:space="preserve">Aufträge: BaseLinker-Sync, Status-Tracking, Versandetiketten via SendCloud</w:t>
+        <w:t xml:space="preserve">Eigenes OMS: Order-Intake direkt von eBay/Kaufland, 9-Stufen-Status-Engine, Pick/Pack-Workflow, SendCloud-Labeldruck, Tracking-Push an Marktplätze</w:t>
       </w:r>
     </w:p>
     <w:p>
@@ -443,7 +443,7 @@
           <w:sz w:val="22"/>
           <w:szCs w:val="22"/>
         </w:rPr>
-        <w:t xml:space="preserve">Eigenes Order Management (aktuell via BaseLinker)</w:t>
+        <w:t xml:space="preserve">Integration-Wizard für Self-Service Onboarding</w:t>
       </w:r>
     </w:p>
     <w:p>
@@ -461,7 +461,7 @@
           <w:sz w:val="22"/>
           <w:szCs w:val="22"/>
         </w:rPr>
-        <w:t xml:space="preserve">Integration-Wizard für Self-Service Onboarding</w:t>
+        <w:t xml:space="preserve">Amazon, Shopify, OTTO, Etsy – alles geplant, nichts gebaut</w:t>
       </w:r>
     </w:p>
     <w:p>
@@ -479,7 +479,7 @@
           <w:sz w:val="22"/>
           <w:szCs w:val="22"/>
         </w:rPr>
-        <w:t xml:space="preserve">Amazon, Shopify, OTTO, Etsy – alles geplant, nichts gebaut</w:t>
+        <w:t xml:space="preserve">Multi-Tenancy für SaaS-Betrieb</w:t>
       </w:r>
     </w:p>
     <w:p>
@@ -497,7 +497,7 @@
           <w:sz w:val="22"/>
           <w:szCs w:val="22"/>
         </w:rPr>
-        <w:t xml:space="preserve">Multi-Tenancy für SaaS-Betrieb</w:t>
+        <w:t xml:space="preserve">Stripe-Billing für Abonnements</w:t>
       </w:r>
     </w:p>
     <w:p>
@@ -515,7 +515,7 @@
           <w:sz w:val="22"/>
           <w:szCs w:val="22"/>
         </w:rPr>
-        <w:t xml:space="preserve">Stripe-Billing für Abonnements</w:t>
+        <w:t xml:space="preserve">Rechnungs-Engine (PDF-Generierung + Buchhaltungs-Export) fehlt noch</w:t>
       </w:r>
     </w:p>
     <w:p>
@@ -3480,7 +3480,7 @@
         <w:rPr>
           <w:rFonts w:ascii="Arial" w:cs="Arial" w:eastAsia="Arial" w:hAnsi="Arial"/>
         </w:rPr>
-        <w:t xml:space="preserve">BaseLinker-Abhängigkeit (P1)</w:t>
+        <w:t xml:space="preserve">BaseLinker noch nicht vollständig ablösbar (P2)</w:t>
       </w:r>
     </w:p>
     <w:p>
@@ -3493,7 +3493,7 @@
           <w:sz w:val="22"/>
           <w:szCs w:val="22"/>
         </w:rPr>
-        <w:t xml:space="preserve">Das gesamte Order-Management läuft über BaseLinker. AvyCloud hat kein eigenes OMS. Wenn BaseLinker ausfällt oder die Preise erhöht, ist AvyCloud handlungsunfähig. Die Roadmap plant den Ersatz, aber das ist ein Projekt von mehreren Monaten.</w:t>
+        <w:t xml:space="preserve">AvyCloud hat bereits ein eigenes OMS (Order-Intake, State-Machine, Labels, Tracking-Push), nutzt BaseLinker aber noch als Fallback für Order-Sync, historische Retouren-Daten und Open-Order-Bestandsreservierung. Die vollständige Ablösung erfordert noch eine eigene Rechnungs-Engine und die Migration der verbleibenden BaseLinker-Datenquellen.</w:t>
       </w:r>
     </w:p>
     <w:p>
@@ -3694,6 +3694,35 @@
         <w:rPr>
           <w:rFonts w:ascii="Arial" w:cs="Arial" w:eastAsia="Arial" w:hAnsi="Arial"/>
         </w:rPr>
+        <w:t xml:space="preserve">Eigenes OMS mit voller Prozesskette</w:t>
+      </w:r>
+    </w:p>
+    <w:p>
+      <w:pPr>
+        <w:spacing w:after="120"/>
+      </w:pPr>
+      <w:r>
+        <w:rPr>
+          <w:rFonts w:ascii="Arial" w:cs="Arial" w:eastAsia="Arial" w:hAnsi="Arial"/>
+          <w:sz w:val="22"/>
+          <w:szCs w:val="22"/>
+        </w:rPr>
+        <w:t xml:space="preserve">AvyCloud hat ein vollständiges eigenes Order Management System aufgebaut: Direkter Order-Intake von eBay (GetOrders) und Kaufland (/v2/orders), eine 9-Stufen-Status-Engine (pending → confirmed → picking → packed → shipped → delivered), Pick/Pack-Workflows für Desktop und Mobile mit Barcode-Scanning, SendCloud-Labelerstellung mit automatischer Carrier-Auswahl nach Gewicht, und nativer Tracking-Push an eBay (CompleteSale) und Kaufland (PATCH /v2/order-units/ship). Dazu eine Returns-Engine mit Marketplace-Sync, Restock-Logik und Erstattungs-Workflow. BaseLinker dient nur noch als Fallback.</w:t>
+      </w:r>
+    </w:p>
+    <w:p>
+      <w:pPr>
+        <w:spacing w:after="100"/>
+      </w:pPr>
+    </w:p>
+    <w:p>
+      <w:pPr>
+        <w:pStyle w:val="Heading2"/>
+      </w:pPr>
+      <w:r>
+        <w:rPr>
+          <w:rFonts w:ascii="Arial" w:cs="Arial" w:eastAsia="Arial" w:hAnsi="Arial"/>
+        </w:rPr>
         <w:t xml:space="preserve">Marketplace-Tiefe beachtlich</w:t>
       </w:r>
     </w:p>
@@ -3707,7 +3736,7 @@
           <w:sz w:val="22"/>
           <w:szCs w:val="22"/>
         </w:rPr>
-        <w:t xml:space="preserve">eBay (OAuth + Trading API + REST API + Taxonomy + Gap-Analyse + Publish) und Kaufland (HMAC + SKU-Index + Category-Mapping) sind tief integriert. Nicht nur Listing-Erstellung, sondern auch Preis-Monitoring, Bestandssync und Listing-Audit. BaseLinker als Zwischenschicht für Order-Management funktioniert.</w:t>
+        <w:t xml:space="preserve">eBay (OAuth + Trading API + REST API + Taxonomy + Gap-Analyse + Publish) und Kaufland (HMAC + SKU-Index + Category-Mapping) sind tief integriert. Nicht nur Listing-Erstellung, sondern auch Preis-Monitoring, Bestandssync, Listing-Audit und direkter Order-Intake.</w:t>
       </w:r>
     </w:p>
     <w:p>
@@ -3781,6 +3810,35 @@
         <w:rPr>
           <w:rFonts w:ascii="Arial" w:cs="Arial" w:eastAsia="Arial" w:hAnsi="Arial"/>
         </w:rPr>
+        <w:t xml:space="preserve">Versand &amp; Retouren als eigene Engines</w:t>
+      </w:r>
+    </w:p>
+    <w:p>
+      <w:pPr>
+        <w:spacing w:after="120"/>
+      </w:pPr>
+      <w:r>
+        <w:rPr>
+          <w:rFonts w:ascii="Arial" w:cs="Arial" w:eastAsia="Arial" w:hAnsi="Arial"/>
+          <w:sz w:val="22"/>
+          <w:szCs w:val="22"/>
+        </w:rPr>
+        <w:t xml:space="preserve">Die Shipping-Engine erstellt Labels über SendCloud mit automatischer Carrier-Auswahl nach Gewicht (DHL &lt;1kg, DPD 2-10kg), konfigurierbaren Carrier-Rules, Bulk-Label-Erstellung und automatischem Tracking-Push an eBay/Kaufland. Die Returns-Engine verwaltet Retouren mit Marketplace-Sync, Zustands-Kategorisierung (A/B/C-Ware), automatischem Restock und Erstattungs-Workflow. Beides nativ, nicht über BaseLinker.</w:t>
+      </w:r>
+    </w:p>
+    <w:p>
+      <w:pPr>
+        <w:spacing w:after="100"/>
+      </w:pPr>
+    </w:p>
+    <w:p>
+      <w:pPr>
+        <w:pStyle w:val="Heading2"/>
+      </w:pPr>
+      <w:r>
+        <w:rPr>
+          <w:rFonts w:ascii="Arial" w:cs="Arial" w:eastAsia="Arial" w:hAnsi="Arial"/>
+        </w:rPr>
         <w:t xml:space="preserve">Internationalisierung von Anfang an</w:t>
       </w:r>
     </w:p>
@@ -3905,7 +3963,7 @@
         <w:rPr>
           <w:rFonts w:ascii="Arial" w:cs="Arial" w:eastAsia="Arial" w:hAnsi="Arial"/>
         </w:rPr>
-        <w:t xml:space="preserve">Tier 3: Eigenes OMS (Woche 5-8)</w:t>
+        <w:t xml:space="preserve">Tier 3: OMS vervollständigen + BaseLinker ablösen (Woche 5-8)</w:t>
       </w:r>
     </w:p>
     <w:p>
@@ -3918,7 +3976,7 @@
           <w:sz w:val="22"/>
           <w:szCs w:val="22"/>
         </w:rPr>
-        <w:t xml:space="preserve">Impact: STRATEGISCH | Aufwand: SEHR HOCH</w:t>
+        <w:t xml:space="preserve">Impact: STRATEGISCH | Aufwand: MITTEL-HOCH</w:t>
       </w:r>
     </w:p>
     <w:p>
@@ -3931,7 +3989,7 @@
           <w:sz w:val="22"/>
           <w:szCs w:val="22"/>
         </w:rPr>
-        <w:t xml:space="preserve">Marketplace Order Intake (eBay/Kaufland direkt), eigene Status-Engine (pending→confirmed→packed→shipped→delivered), SendCloud Label-Erzeugung, Tracking-Webhooks, Rechnungs-PDF. Das macht AvyCloud unabhängig von BaseLinker.</w:t>
+        <w:t xml:space="preserve">Das OMS-Grundgerüst steht bereits (Order-Intake, State-Machine, Labels, Tracking-Push). Was fehlt: Rechnungs-Engine (PDF + SevDesk-Export), Tracking-Webhooks von SendCloud (parcel_shipped/delivered), und die Migration der letzten BaseLinker-Abhängigkeiten (Open-Order-Reservierung, Dashboard-Revenue). Danach kann BaseLinker komplett optional werden.</w:t>
       </w:r>
     </w:p>
     <w:p>
@@ -5571,7 +5629,7 @@
           <w:sz w:val="22"/>
           <w:szCs w:val="22"/>
         </w:rPr>
-        <w:t xml:space="preserve">Ehrliche Antwort: Weder noch. AvyCloud steht zwischen Alpha und Beta. Die Architektur ist Enterprise-grade, aber das Feature-Set ist MVP-minus. Hier ist der Reifegrad nach Bereichen:</w:t>
+        <w:t xml:space="preserve">Ehrliche Antwort: Näher am Appstore als am Coffeeshop. AvyCloud steht an der Schwelle zur Beta. Die Architektur ist Enterprise-grade, das OMS funktioniert end-to-end, die KI-Pipeline ist produktionsreif. Die größten Lücken sind Frontend-seitig (FAKE→REAL) und beim Self-Service-Onboarding. Hier ist der Reifegrad nach Bereichen:</w:t>
       </w:r>
     </w:p>
     <w:p>
@@ -6267,7 +6325,7 @@
               <w:bottom w:val="single" w:color="D5D8DC" w:sz="1"/>
               <w:right w:val="single" w:color="D5D8DC" w:sz="1"/>
             </w:tcBorders>
-            <w:shd w:fill="FEF9E7" w:val="clear"/>
+            <w:shd w:fill="D4EFDF" w:val="clear"/>
             <w:tcMar>
               <w:top w:type="dxa" w:w="60"/>
               <w:left w:type="dxa" w:w="100"/>
@@ -6285,7 +6343,7 @@
                 <w:sz w:val="20"/>
                 <w:szCs w:val="20"/>
               </w:rPr>
-              <w:t xml:space="preserve">EXTERN</w:t>
+              <w:t xml:space="preserve">LIVE</w:t>
             </w:r>
           </w:p>
         </w:tc>
@@ -6312,7 +6370,7 @@
                 <w:sz w:val="20"/>
                 <w:szCs w:val="20"/>
               </w:rPr>
-              <w:t xml:space="preserve">Via BaseLinker, kein eigenes OMS</w:t>
+              <w:t xml:space="preserve">Eigenes OMS: Intake, State-Machine, Labels, Tracking-Push. BL nur Fallback</w:t>
             </w:r>
           </w:p>
         </w:tc>
@@ -7102,7 +7160,7 @@
                 <w:sz w:val="20"/>
                 <w:szCs w:val="20"/>
               </w:rPr>
-              <w:t xml:space="preserve">OMS Phase A</w:t>
+              <w:t xml:space="preserve">OMS vervollständigen</w:t>
             </w:r>
           </w:p>
         </w:tc>
@@ -7156,7 +7214,7 @@
                 <w:sz w:val="20"/>
                 <w:szCs w:val="20"/>
               </w:rPr>
-              <w:t xml:space="preserve">Eigene Auftragsverarbeitung</w:t>
+              <w:t xml:space="preserve">Rechnungs-Engine, Tracking-Webhooks, BL-Ablösung</w:t>
             </w:r>
           </w:p>
         </w:tc>
@@ -7437,7 +7495,7 @@
           <w:sz w:val="22"/>
           <w:szCs w:val="22"/>
         </w:rPr>
-        <w:t xml:space="preserve">AvyCloud ist aktuell ein sehr fortgeschrittener Prototyp mit Production-Qualität in den Kernbereichen (KI, Marketplace, Architektur), aber signifikanten Lücken in der Feature-Breite. Der Weg zum Beta-Launch ist 12-14 Wochen bei Vollzeit-Entwicklung. Der Weg zum zahlenden Kunden ist 16-20 Wochen.</w:t>
+        <w:t xml:space="preserve">AvyCloud ist weiter als ein typischer Prototyp: Die Kernbereiche (KI, Marketplace, OMS, Architektur) haben Production-Qualität. Die größten Lücken liegen in der Frontend-Anbindung (FAKE→REAL) und im Self-Service-Onboarding. Der Weg zum Beta-Launch ist 10-12 Wochen bei Vollzeit-Entwicklung. Der Weg zum zahlenden Kunden ist 14-18 Wochen.</w:t>
       </w:r>
     </w:p>
     <w:p>
@@ -8010,7 +8068,7 @@
                 <w:sz w:val="20"/>
                 <w:szCs w:val="20"/>
               </w:rPr>
-              <w:t xml:space="preserve">Nischen-Startpunkt</w:t>
+              <w:t xml:space="preserve">Solider Startpunkt + eigenes OMS</w:t>
             </w:r>
           </w:p>
         </w:tc>
@@ -8571,7 +8629,7 @@
                 <w:sz w:val="20"/>
                 <w:szCs w:val="20"/>
               </w:rPr>
-              <w:t xml:space="preserve">80.000-150.000 EUR</w:t>
+              <w:t xml:space="preserve">120.000-200.000 EUR</w:t>
             </w:r>
           </w:p>
         </w:tc>
@@ -8598,7 +8656,7 @@
                 <w:sz w:val="20"/>
                 <w:szCs w:val="20"/>
               </w:rPr>
-              <w:t xml:space="preserve">Entwicklungskosten-Basis (12-18 PM × 8K-10K)</w:t>
+              <w:t xml:space="preserve">Entwicklungskosten-Basis (12-18 PM × 8K-10K) + OMS-Wert</w:t>
             </w:r>
           </w:p>
         </w:tc>
@@ -8654,7 +8712,7 @@
                 <w:sz w:val="20"/>
                 <w:szCs w:val="20"/>
               </w:rPr>
-              <w:t xml:space="preserve">250.000-500.000 EUR</w:t>
+              <w:t xml:space="preserve">300.000-600.000 EUR</w:t>
             </w:r>
           </w:p>
         </w:tc>
@@ -8681,7 +8739,7 @@
                 <w:sz w:val="20"/>
                 <w:szCs w:val="20"/>
               </w:rPr>
-              <w:t xml:space="preserve">Tech-Asset + IP + Marktpositionierung</w:t>
+              <w:t xml:space="preserve">Tech-Asset + IP + OMS + KI-Pipeline + Marktpositionierung</w:t>
             </w:r>
           </w:p>
         </w:tc>
@@ -8737,7 +8795,7 @@
                 <w:sz w:val="20"/>
                 <w:szCs w:val="20"/>
               </w:rPr>
-              <w:t xml:space="preserve">500.000-1.500.000 EUR</w:t>
+              <w:t xml:space="preserve">600.000-1.500.000 EUR</w:t>
             </w:r>
           </w:p>
         </w:tc>
@@ -8938,23 +8996,7 @@
           <w:sz w:val="22"/>
           <w:szCs w:val="22"/>
         </w:rPr>
-        <w:t xml:space="preserve">Marketplace-Tiefe: eBay + Kaufland sind tief integriert (nicht nur Listing, sondern Audit, Preis-Sync, Taxonomy). Das nachzubauen dauert Monate.</w:t>
-      </w:r>
-    </w:p>
-    <w:p>
-      <w:pPr>
-        <w:spacing w:after="200"/>
-      </w:pPr>
-    </w:p>
-    <w:p>
-      <w:pPr>
-        <w:pStyle w:val="Heading2"/>
-      </w:pPr>
-      <w:r>
-        <w:rPr>
-          <w:rFonts w:ascii="Arial" w:cs="Arial" w:eastAsia="Arial" w:hAnsi="Arial"/>
-        </w:rPr>
-        <w:t xml:space="preserve">Wertvernichter</w:t>
+        <w:t xml:space="preserve">Eigenes OMS: Order-Intake, 9-Stufen-State-Machine, SendCloud-Labels, Tracking-Push an eBay/Kaufland, Returns-Engine – das ist kein Wrapper um BaseLinker, sondern eigenständige Infrastruktur.</w:t>
       </w:r>
     </w:p>
     <w:p>
@@ -8972,7 +9014,23 @@
           <w:sz w:val="22"/>
           <w:szCs w:val="22"/>
         </w:rPr>
-        <w:t xml:space="preserve">Solo-Entwickler-Risiko: Eine Person = Single Point of Failure. Investoren hassen das.</w:t>
+        <w:t xml:space="preserve">Marketplace-Tiefe: eBay + Kaufland sind tief integriert (nicht nur Listing, sondern Audit, Preis-Sync, Taxonomy, Order-Intake). Das nachzubauen dauert Monate.</w:t>
+      </w:r>
+    </w:p>
+    <w:p>
+      <w:pPr>
+        <w:spacing w:after="200"/>
+      </w:pPr>
+    </w:p>
+    <w:p>
+      <w:pPr>
+        <w:pStyle w:val="Heading2"/>
+      </w:pPr>
+      <w:r>
+        <w:rPr>
+          <w:rFonts w:ascii="Arial" w:cs="Arial" w:eastAsia="Arial" w:hAnsi="Arial"/>
+        </w:rPr>
+        <w:t xml:space="preserve">Wertvernichter</w:t>
       </w:r>
     </w:p>
     <w:p>
@@ -8990,7 +9048,7 @@
           <w:sz w:val="22"/>
           <w:szCs w:val="22"/>
         </w:rPr>
-        <w:t xml:space="preserve">Keine Kunden: Null Revenue, null Beta-Tester, null Social Proof.</w:t>
+        <w:t xml:space="preserve">Solo-Entwickler-Risiko: Eine Person = Single Point of Failure. Investoren hassen das.</w:t>
       </w:r>
     </w:p>
     <w:p>
@@ -9008,7 +9066,7 @@
           <w:sz w:val="22"/>
           <w:szCs w:val="22"/>
         </w:rPr>
-        <w:t xml:space="preserve">12 FAKE-Views: Die Hälfte des Frontends funktioniert nicht wirklich.</w:t>
+        <w:t xml:space="preserve">Keine Kunden: Null Revenue, null Beta-Tester, null Social Proof.</w:t>
       </w:r>
     </w:p>
     <w:p>
@@ -9026,7 +9084,7 @@
           <w:sz w:val="22"/>
           <w:szCs w:val="22"/>
         </w:rPr>
-        <w:t xml:space="preserve">Keine Tests: 10% Testabdeckung = hohes Regressions-Risiko.</w:t>
+        <w:t xml:space="preserve">12 FAKE-Views: Die Hälfte des Frontends funktioniert nicht wirklich.</w:t>
       </w:r>
     </w:p>
     <w:p>
@@ -9044,7 +9102,25 @@
           <w:sz w:val="22"/>
           <w:szCs w:val="22"/>
         </w:rPr>
-        <w:t xml:space="preserve">BaseLinker-Abhängigkeit: Kein eigenes OMS = strategische Verwundbarkeit.</w:t>
+        <w:t xml:space="preserve">Keine Tests: 10% Testabdeckung = hohes Regressions-Risiko.</w:t>
+      </w:r>
+    </w:p>
+    <w:p>
+      <w:pPr>
+        <w:pStyle w:val="ListParagraph"/>
+        <w:numPr>
+          <w:ilvl w:val="0"/>
+          <w:numId w:val="2"/>
+        </w:numPr>
+        <w:spacing w:after="60"/>
+      </w:pPr>
+      <w:r>
+        <w:rPr>
+          <w:rFonts w:ascii="Arial" w:cs="Arial" w:eastAsia="Arial" w:hAnsi="Arial"/>
+          <w:sz w:val="22"/>
+          <w:szCs w:val="22"/>
+        </w:rPr>
+        <w:t xml:space="preserve">BaseLinker-Reste: OMS ist nativ, aber Fallback-Abhängigkeiten (Reservierung, Revenue-Reports) bestehen noch.</w:t>
       </w:r>
     </w:p>
     <w:p>
@@ -9073,7 +9149,7 @@
           <w:sz w:val="22"/>
           <w:szCs w:val="22"/>
         </w:rPr>
-        <w:t xml:space="preserve">AvyCloud ist ein technisch beeindruckendes Solo-Projekt mit einem echten Differenzierungsmerkmal (KI-Produktintelligenz) in einem wachsenden Markt. Der aktuelle Wert liegt realistisch bei 250.000-500.000 EUR als Tech-Asset. Mit 3-4 Monaten fokussierter Entwicklung (FAKE→REAL, Self-Service, OMS, Tests) und den ersten zahlenden Kunden steigt der Wert auf 500K-1,5M EUR.</w:t>
+        <w:t xml:space="preserve">AvyCloud ist ein technisch beeindruckendes Solo-Projekt mit einem echten Differenzierungsmerkmal (KI-Produktintelligenz) und einem bereits funktionsfähigen OMS in einem wachsenden Markt. Der aktuelle Wert liegt realistisch bei 300.000-600.000 EUR als Tech-Asset. Mit 3-4 Monaten fokussierter Entwicklung (FAKE→REAL, Self-Service, Rechnungs-Engine, Tests) und den ersten zahlenden Kunden steigt der Wert auf 600K-1,5M EUR.</w:t>
       </w:r>
     </w:p>
     <w:p>
@@ -9091,7 +9167,7 @@
           <w:sz w:val="22"/>
           <w:szCs w:val="22"/>
         </w:rPr>
-        <w:t xml:space="preserve">Der schnellste Weg zum Wertanstieg: Die 12 FAKE-Views auf REAL umstellen, 5 Beta-Kunden gewinnen, und eine Seed-Runde pitchen mit dem Narrativ: "Das einzige KI-gestützte Multi-Channel-Tool für den deutschen E-Commerce."</w:t>
+        <w:t xml:space="preserve">Der schnellste Weg zum Wertanstieg: Die 12 FAKE-Views auf REAL umstellen, 5 Beta-Kunden gewinnen, und eine Seed-Runde pitchen mit dem Narrativ: "Das einzige KI-gestützte Multi-Channel-Tool für den deutschen E-Commerce – mit eigenem OMS von Order-Intake bis Tracking-Push."</w:t>
       </w:r>
     </w:p>
     <w:sectPr>

</xml_diff>

<commit_message>
feat(branding): update sidebar logo to align with brand guidelines
- Replaced text "AvyCloud" and "Product Intelligence" in the sidebar with the brand's wordmark logo, ensuring compliance with the new branding standards.
- Implemented theme-aware logo display, using `logo_darkmode.png` for dark themes and `logo_brightmode.png` for light themes.
- Updated CSS to manage logo visibility based on the current theme, enhancing the user interface consistency across different modes.
- Documented changes in TASKS.md for clarity on branding updates and logo asset management.
</commit_message>
<xml_diff>
--- a/AvyCloud_Analyse_Marktbewertung.docx
+++ b/AvyCloud_Analyse_Marktbewertung.docx
@@ -373,7 +373,7 @@
           <w:sz w:val="22"/>
           <w:szCs w:val="22"/>
         </w:rPr>
-        <w:t xml:space="preserve">3-Sprachen-Support: Deutsch, Englisch, Türkisch</w:t>
+        <w:t xml:space="preserve">i18n-Infrastruktur: 1.700+ Übersetzungsschlüssel in DE/EN/TR vorbereitet (Sprachumschalter in der UI fehlt noch)</w:t>
       </w:r>
     </w:p>
     <w:p>
@@ -425,7 +425,7 @@
           <w:sz w:val="22"/>
           <w:szCs w:val="22"/>
         </w:rPr>
-        <w:t xml:space="preserve">12 Views zeigen noch Mock-Daten statt echte API-Calls</w:t>
+        <w:t xml:space="preserve">38 API-Funktionen im Frontend definiert aber nirgends aufgerufen – Backend-Features ohne UI (Gap-Analyse, Repricing, Forecast, etc.)</w:t>
       </w:r>
     </w:p>
     <w:p>
@@ -443,7 +443,7 @@
           <w:sz w:val="22"/>
           <w:szCs w:val="22"/>
         </w:rPr>
-        <w:t xml:space="preserve">Integration-Wizard für Self-Service Onboarding</w:t>
+        <w:t xml:space="preserve">Integration-Wizard für Self-Service Onboarding fehlt komplett</w:t>
       </w:r>
     </w:p>
     <w:p>
@@ -462,6 +462,42 @@
           <w:szCs w:val="22"/>
         </w:rPr>
         <w:t xml:space="preserve">Amazon, Shopify, OTTO, Etsy – alles geplant, nichts gebaut</w:t>
+      </w:r>
+    </w:p>
+    <w:p>
+      <w:pPr>
+        <w:pStyle w:val="ListParagraph"/>
+        <w:numPr>
+          <w:ilvl w:val="0"/>
+          <w:numId w:val="2"/>
+        </w:numPr>
+        <w:spacing w:after="60"/>
+      </w:pPr>
+      <w:r>
+        <w:rPr>
+          <w:rFonts w:ascii="Arial" w:cs="Arial" w:eastAsia="Arial" w:hAnsi="Arial"/>
+          <w:sz w:val="22"/>
+          <w:szCs w:val="22"/>
+        </w:rPr>
+        <w:t xml:space="preserve">BaseLinker noch tief eingebettet – App crasht ohne BL-Token beim Start, Order-Sync Default ist BL</w:t>
+      </w:r>
+    </w:p>
+    <w:p>
+      <w:pPr>
+        <w:pStyle w:val="ListParagraph"/>
+        <w:numPr>
+          <w:ilvl w:val="0"/>
+          <w:numId w:val="2"/>
+        </w:numPr>
+        <w:spacing w:after="60"/>
+      </w:pPr>
+      <w:r>
+        <w:rPr>
+          <w:rFonts w:ascii="Arial" w:cs="Arial" w:eastAsia="Arial" w:hAnsi="Arial"/>
+          <w:sz w:val="22"/>
+          <w:szCs w:val="22"/>
+        </w:rPr>
+        <w:t xml:space="preserve">Sprachumschalter fehlt in der UI (Infrastruktur für DE/EN/TR existiert, aber kein Dropdown)</w:t>
       </w:r>
     </w:p>
     <w:p>
@@ -3422,7 +3458,7 @@
         <w:rPr>
           <w:rFonts w:ascii="Arial" w:cs="Arial" w:eastAsia="Arial" w:hAnsi="Arial"/>
         </w:rPr>
-        <w:t xml:space="preserve">12 FAKE-Views (P0)</w:t>
+        <w:t xml:space="preserve">38 Backend-Features ohne Frontend (P1)</w:t>
       </w:r>
     </w:p>
     <w:p>
@@ -3435,7 +3471,7 @@
           <w:sz w:val="22"/>
           <w:szCs w:val="22"/>
         </w:rPr>
-        <w:t xml:space="preserve">12 von 24 Views zeigen Mock-Daten oder Placeholder. MarketplaceListings, Settings, Shipping, Invoices, Returns – alles Frontend-Attrappen. Das Backend hat die Routen, aber das Frontend ruft sie nicht ab. Das ist die größte einzelne Baustelle.</w:t>
+        <w:t xml:space="preserve">Im API-Client (api/client.ts) sind 38 Funktionen definiert, die von keinem einzigen View aufgerufen werden. Das sind fertige Backend-Endpoints ohne UI: eBay Gap-Analyse (9 Funktionen), Repricing/Pricing-Engine (suggestPrice, runRepricingBatch), Produkt-Forecast, Competitor-Overview, Invoice-Export zu SevDesk, Integration-Detail-Ansicht und mehr. Diese Features existieren technisch, sind aber für den User unsichtbar.</w:t>
       </w:r>
     </w:p>
     <w:p>
@@ -3451,6 +3487,35 @@
         <w:rPr>
           <w:rFonts w:ascii="Arial" w:cs="Arial" w:eastAsia="Arial" w:hAnsi="Arial"/>
         </w:rPr>
+        <w:t xml:space="preserve">BaseLinker tief eingebettet (P0)</w:t>
+      </w:r>
+    </w:p>
+    <w:p>
+      <w:pPr>
+        <w:spacing w:after="120"/>
+      </w:pPr>
+      <w:r>
+        <w:rPr>
+          <w:rFonts w:ascii="Arial" w:cs="Arial" w:eastAsia="Arial" w:hAnsi="Arial"/>
+          <w:sz w:val="22"/>
+          <w:szCs w:val="22"/>
+        </w:rPr>
+        <w:t xml:space="preserve">BaseLinker ist kein optionaler Fallback, sondern tief im Core verankert. Konkreter Befund: (1) Die App crasht beim Start ohne BaseLinker-API-Token (syncInventoriesFromBaseLinker() in index.js ist blocking). (2) Der Default ORDER_SOURCE ist BaseLinker, nicht nativ. (3) Order-Status-Updates laufen über callBaseLinker(setOrderStatus). (4) Revenue-Dashboard-Metriken kommen aus BaseLinker. (5) 52 BaseLinker-spezifische Dateien im Backend. Zwar existieren native Alternativen (ORDER_SOURCE=native, eBay/Kaufland-Intake), aber sie sind nicht der Default-Pfad.</w:t>
+      </w:r>
+    </w:p>
+    <w:p>
+      <w:pPr>
+        <w:spacing w:after="100"/>
+      </w:pPr>
+    </w:p>
+    <w:p>
+      <w:pPr>
+        <w:pStyle w:val="Heading3"/>
+      </w:pPr>
+      <w:r>
+        <w:rPr>
+          <w:rFonts w:ascii="Arial" w:cs="Arial" w:eastAsia="Arial" w:hAnsi="Arial"/>
+        </w:rPr>
         <w:t xml:space="preserve">Kein Self-Service Onboarding (P0)</w:t>
       </w:r>
     </w:p>
@@ -3464,7 +3529,7 @@
           <w:sz w:val="22"/>
           <w:szCs w:val="22"/>
         </w:rPr>
-        <w:t xml:space="preserve">Der Integrations-Hub zeigt 6 Karten, aber kein einziger Integration-Wizard existiert. Kein neuer Kunde kann sich selbst eBay oder Kaufland anbinden. Für ein SaaS-Produkt ist das ein Showstopper.</w:t>
+        <w:t xml:space="preserve">Der Integrations-Hub zeigt Karten mit echtem Verbindungsstatus, aber kein Integration-Wizard existiert. Kein neuer Kunde kann sich selbst eBay oder Kaufland anbinden. API-Credentials werden über Google Secret Manager verwaltet – ohne Admin-Zugang unmöglich. Für ein SaaS-Produkt ist das ein Showstopper.</w:t>
       </w:r>
     </w:p>
     <w:p>
@@ -3480,7 +3545,7 @@
         <w:rPr>
           <w:rFonts w:ascii="Arial" w:cs="Arial" w:eastAsia="Arial" w:hAnsi="Arial"/>
         </w:rPr>
-        <w:t xml:space="preserve">BaseLinker noch nicht vollständig ablösbar (P2)</w:t>
+        <w:t xml:space="preserve">i18n ohne Sprachumschalter (P2)</w:t>
       </w:r>
     </w:p>
     <w:p>
@@ -3493,7 +3558,7 @@
           <w:sz w:val="22"/>
           <w:szCs w:val="22"/>
         </w:rPr>
-        <w:t xml:space="preserve">AvyCloud hat bereits ein eigenes OMS (Order-Intake, State-Machine, Labels, Tracking-Push), nutzt BaseLinker aber noch als Fallback für Order-Sync, historische Retouren-Daten und Open-Order-Bestandsreservierung. Die vollständige Ablösung erfordert noch eine eigene Rechnungs-Engine und die Migration der verbleibenden BaseLinker-Datenquellen.</w:t>
+        <w:t xml:space="preserve">1.700+ Übersetzungsschlüssel in Deutsch, Englisch und Türkisch existieren – vollständig, keine Stubs. Die setLocale()-Funktion ist implementiert. Aber: Kein einziger View ruft setLocale() auf. Es gibt keinen Sprachumschalter in der UI – nicht in ProfileSettings, nicht in der Sidebar, nicht in der Topbar. Die Sprache wird einmalig beim App-Start per Browser-Locale erkannt und ist danach nicht mehr änderbar. 80% der Arbeit ist getan, aber die letzten 20% (ein Dropdown) fehlen.</w:t>
       </w:r>
     </w:p>
     <w:p>
@@ -3522,7 +3587,7 @@
           <w:sz w:val="22"/>
           <w:szCs w:val="22"/>
         </w:rPr>
-        <w:t xml:space="preserve">Eine ausgefeilte Pricing-Engine existiert im Backend (3-Tier Strategie: EAN, Kategorie, LLM), aber es gibt kein Frontend, keinen automatischen Runner, keine Unterscheidung Neu/Gebraucht. Ein fertiges Feature, das niemand nutzen kann.</w:t>
+        <w:t xml:space="preserve">Eine ausgefeilte Pricing-Engine existiert im Backend (3-Tier Strategie: EAN, Kategorie, LLM), aber es gibt kein Frontend, keinen automatischen Runner, keine Unterscheidung Neu/Gebraucht. suggestPrice() und runRepricingBatch() sind im API-Client definiert aber werden nirgends aufgerufen.</w:t>
       </w:r>
     </w:p>
     <w:p>
@@ -3694,7 +3759,7 @@
         <w:rPr>
           <w:rFonts w:ascii="Arial" w:cs="Arial" w:eastAsia="Arial" w:hAnsi="Arial"/>
         </w:rPr>
-        <w:t xml:space="preserve">Eigenes OMS mit voller Prozesskette</w:t>
+        <w:t xml:space="preserve">OMS mit nativer Prozesskette (im Aufbau)</w:t>
       </w:r>
     </w:p>
     <w:p>
@@ -3707,7 +3772,7 @@
           <w:sz w:val="22"/>
           <w:szCs w:val="22"/>
         </w:rPr>
-        <w:t xml:space="preserve">AvyCloud hat ein vollständiges eigenes Order Management System aufgebaut: Direkter Order-Intake von eBay (GetOrders) und Kaufland (/v2/orders), eine 9-Stufen-Status-Engine (pending → confirmed → picking → packed → shipped → delivered), Pick/Pack-Workflows für Desktop und Mobile mit Barcode-Scanning, SendCloud-Labelerstellung mit automatischer Carrier-Auswahl nach Gewicht, und nativer Tracking-Push an eBay (CompleteSale) und Kaufland (PATCH /v2/order-units/ship). Dazu eine Returns-Engine mit Marketplace-Sync, Restock-Logik und Erstattungs-Workflow. BaseLinker dient nur noch als Fallback.</w:t>
+        <w:t xml:space="preserve">AvyCloud hat die Bausteine für ein eigenes Order Management System: Direkter Order-Intake von eBay (GetOrders) und Kaufland (/v2/orders) über ORDER_SOURCE=native, eine 9-Stufen-Status-Engine, Pick/Pack-Workflows für Desktop und Mobile mit Barcode-Scanning, SendCloud-Labelerstellung mit automatischer Carrier-Auswahl nach Gewicht, und nativer Tracking-Push an eBay (CompleteSale) und Kaufland. Dazu eine Returns-Engine mit Marketplace-Sync und Restock-Logik. Wichtige Einschränkung: Der Default-Pfad läuft noch über BaseLinker. Die nativen Alternativen existieren als Feature-Flags, sind aber nicht der Standard.</w:t>
       </w:r>
     </w:p>
     <w:p>
@@ -3839,7 +3904,7 @@
         <w:rPr>
           <w:rFonts w:ascii="Arial" w:cs="Arial" w:eastAsia="Arial" w:hAnsi="Arial"/>
         </w:rPr>
-        <w:t xml:space="preserve">Internationalisierung von Anfang an</w:t>
+        <w:t xml:space="preserve">i18n-Infrastruktur vorausschauend angelegt</w:t>
       </w:r>
     </w:p>
     <w:p>
@@ -3852,7 +3917,7 @@
           <w:sz w:val="22"/>
           <w:szCs w:val="22"/>
         </w:rPr>
-        <w:t xml:space="preserve">DE/EN/TR von Anfang an eingebaut. 2.500+ Übersetzungsschlüssel, sauber über React Context + localStorage. Das spart später enormen Aufwand.</w:t>
+        <w:t xml:space="preserve">1.700+ Übersetzungsschlüssel in DE, EN und TR – vollständig, keine Stubs. React Context + localStorage-Persistenz. setLocale() ist implementiert, detectLocale() erkennt Browser-Sprache. Das spart später enormen Aufwand – es fehlt nur noch ein Dropdown in der UI, um die Sprache tatsächlich umschalten zu können.</w:t>
       </w:r>
     </w:p>
     <w:p>
@@ -3879,7 +3944,7 @@
         <w:rPr>
           <w:rFonts w:ascii="Arial" w:cs="Arial" w:eastAsia="Arial" w:hAnsi="Arial"/>
         </w:rPr>
-        <w:t xml:space="preserve">Tier 1: FAKE→REAL Offensive (Woche 1-2)</w:t>
+        <w:t xml:space="preserve">Tier 1: 38 Backend-Features ans Frontend anbinden (Woche 1-3)</w:t>
       </w:r>
     </w:p>
     <w:p>
@@ -3892,7 +3957,7 @@
           <w:sz w:val="22"/>
           <w:szCs w:val="22"/>
         </w:rPr>
-        <w:t xml:space="preserve">Impact: MAXIMAL | Aufwand: MITTEL</w:t>
+        <w:t xml:space="preserve">Impact: MAXIMAL | Aufwand: MITTEL-HOCH</w:t>
       </w:r>
     </w:p>
     <w:p>
@@ -3905,7 +3970,7 @@
           <w:sz w:val="22"/>
           <w:szCs w:val="22"/>
         </w:rPr>
-        <w:t xml:space="preserve">Die 12 FAKE-Views auf echte API-Calls umstellen ist der höchste ROI-Move. Das Backend hat bereits die Routen – es fehlt nur die Frontend-Anbindung. Danach sieht AvyCloud zum ersten Mal wie ein echtes Produkt aus.</w:t>
+        <w:t xml:space="preserve">Alle Views zeigen echte Daten – das ist bereits Realität. Aber 38 API-Funktionen im Frontend-Client (api/client.ts) werden von keinem View aufgerufen. Das sind fertige Backend-Features ohne UI: eBay Gap-Analyse, Repricing-Dashboard, Produkt-Forecast, Competitor-Übersicht, SevDesk-Export und mehr. Diese Features sichtbar machen ist der höchste ROI-Move.</w:t>
       </w:r>
     </w:p>
     <w:p>
@@ -5629,7 +5694,7 @@
           <w:sz w:val="22"/>
           <w:szCs w:val="22"/>
         </w:rPr>
-        <w:t xml:space="preserve">Ehrliche Antwort: Näher am Appstore als am Coffeeshop. AvyCloud steht an der Schwelle zur Beta. Die Architektur ist Enterprise-grade, das OMS funktioniert end-to-end, die KI-Pipeline ist produktionsreif. Die größten Lücken sind Frontend-seitig (FAKE→REAL) und beim Self-Service-Onboarding. Hier ist der Reifegrad nach Bereichen:</w:t>
+        <w:t xml:space="preserve">Ehrliche Antwort: Näher am Appstore als am Coffeeshop. AvyCloud steht an der Schwelle zur Beta. Die Architektur ist Enterprise-grade, alle Views zeigen echte Daten, die KI-Pipeline ist produktionsreif. Die größten Lücken: 38 Backend-Features noch ohne UI, BaseLinker tief eingebettet, kein Self-Service-Onboarding. Hier ist der Reifegrad nach Bereichen:</w:t>
       </w:r>
     </w:p>
     <w:p>
@@ -6325,7 +6390,7 @@
               <w:bottom w:val="single" w:color="D5D8DC" w:sz="1"/>
               <w:right w:val="single" w:color="D5D8DC" w:sz="1"/>
             </w:tcBorders>
-            <w:shd w:fill="D4EFDF" w:val="clear"/>
+            <w:shd w:fill="FEF9E7" w:val="clear"/>
             <w:tcMar>
               <w:top w:type="dxa" w:w="60"/>
               <w:left w:type="dxa" w:w="100"/>
@@ -6343,7 +6408,7 @@
                 <w:sz w:val="20"/>
                 <w:szCs w:val="20"/>
               </w:rPr>
-              <w:t xml:space="preserve">LIVE</w:t>
+              <w:t xml:space="preserve">HYBRID</w:t>
             </w:r>
           </w:p>
         </w:tc>
@@ -6370,7 +6435,7 @@
                 <w:sz w:val="20"/>
                 <w:szCs w:val="20"/>
               </w:rPr>
-              <w:t xml:space="preserve">Eigenes OMS: Intake, State-Machine, Labels, Tracking-Push. BL nur Fallback</w:t>
+              <w:t xml:space="preserve">Eigenes OMS vorhanden (Intake, State-Machine, Labels, Tracking). Default-Pfad läuft noch über BaseLinker</w:t>
             </w:r>
           </w:p>
         </w:tc>
@@ -6414,7 +6479,7 @@
               <w:bottom w:val="single" w:color="D5D8DC" w:sz="1"/>
               <w:right w:val="single" w:color="D5D8DC" w:sz="1"/>
             </w:tcBorders>
-            <w:shd w:fill="FADBD8" w:val="clear"/>
+            <w:shd w:fill="FEF9E7" w:val="clear"/>
             <w:tcMar>
               <w:top w:type="dxa" w:w="60"/>
               <w:left w:type="dxa" w:w="100"/>
@@ -6432,7 +6497,7 @@
                 <w:sz w:val="20"/>
                 <w:szCs w:val="20"/>
               </w:rPr>
-              <w:t xml:space="preserve">50%</w:t>
+              <w:t xml:space="preserve">LIVE</w:t>
             </w:r>
           </w:p>
         </w:tc>
@@ -6459,7 +6524,7 @@
                 <w:sz w:val="20"/>
                 <w:szCs w:val="20"/>
               </w:rPr>
-              <w:t xml:space="preserve">12 von 24 Views noch FAKE</w:t>
+              <w:t xml:space="preserve">Alle Views zeigen echte Daten. 38 Backend-Features noch ohne UI</w:t>
             </w:r>
           </w:p>
         </w:tc>
@@ -6994,7 +7059,7 @@
                 <w:sz w:val="20"/>
                 <w:szCs w:val="20"/>
               </w:rPr>
-              <w:t xml:space="preserve">FAKE→REAL + Bugs</w:t>
+              <w:t xml:space="preserve">Backend→Frontend + Bugs</w:t>
             </w:r>
           </w:p>
         </w:tc>
@@ -7021,7 +7086,7 @@
                 <w:sz w:val="20"/>
                 <w:szCs w:val="20"/>
               </w:rPr>
-              <w:t xml:space="preserve">KW 11-12 (März)</w:t>
+              <w:t xml:space="preserve">KW 11-13 (März)</w:t>
             </w:r>
           </w:p>
         </w:tc>
@@ -7048,7 +7113,7 @@
                 <w:sz w:val="20"/>
                 <w:szCs w:val="20"/>
               </w:rPr>
-              <w:t xml:space="preserve">Alle Views zeigen echte Daten</w:t>
+              <w:t xml:space="preserve">38 Backend-Features an UI anbinden</w:t>
             </w:r>
           </w:p>
         </w:tc>
@@ -7495,7 +7560,7 @@
           <w:sz w:val="22"/>
           <w:szCs w:val="22"/>
         </w:rPr>
-        <w:t xml:space="preserve">AvyCloud ist weiter als ein typischer Prototyp: Die Kernbereiche (KI, Marketplace, OMS, Architektur) haben Production-Qualität. Die größten Lücken liegen in der Frontend-Anbindung (FAKE→REAL) und im Self-Service-Onboarding. Der Weg zum Beta-Launch ist 10-12 Wochen bei Vollzeit-Entwicklung. Der Weg zum zahlenden Kunden ist 14-18 Wochen.</w:t>
+        <w:t xml:space="preserve">AvyCloud ist weiter als ein typischer Prototyp: Die Kernbereiche (KI, Marketplace, Architektur) haben Production-Qualität, alle Views zeigen echte Daten. Die größten Lücken: 38 Backend-Features ohne UI, BaseLinker-Ablösung und Self-Service-Onboarding. Der Weg zum Beta-Launch ist 10-12 Wochen bei Vollzeit-Entwicklung. Der Weg zum zahlenden Kunden ist 14-18 Wochen.</w:t>
       </w:r>
     </w:p>
     <w:p>
@@ -9084,7 +9149,7 @@
           <w:sz w:val="22"/>
           <w:szCs w:val="22"/>
         </w:rPr>
-        <w:t xml:space="preserve">12 FAKE-Views: Die Hälfte des Frontends funktioniert nicht wirklich.</w:t>
+        <w:t xml:space="preserve">38 Backend-Features ohne UI: Ein Drittel der Backend-Funktionalität ist für Nutzer unsichtbar (Gap-Analyse, Repricing, Forecast, etc.).</w:t>
       </w:r>
     </w:p>
     <w:p>
@@ -9102,7 +9167,7 @@
           <w:sz w:val="22"/>
           <w:szCs w:val="22"/>
         </w:rPr>
-        <w:t xml:space="preserve">Keine Tests: 10% Testabdeckung = hohes Regressions-Risiko.</w:t>
+        <w:t xml:space="preserve">BaseLinker tief eingebettet: App crasht ohne BL-Token, Default-Order-Sync ist BL, Revenue-Dashboard hängt an BL. Kein optionaler Fallback, sondern Core-Dependency.</w:t>
       </w:r>
     </w:p>
     <w:p>
@@ -9120,7 +9185,25 @@
           <w:sz w:val="22"/>
           <w:szCs w:val="22"/>
         </w:rPr>
-        <w:t xml:space="preserve">BaseLinker-Reste: OMS ist nativ, aber Fallback-Abhängigkeiten (Reservierung, Revenue-Reports) bestehen noch.</w:t>
+        <w:t xml:space="preserve">Keine Tests: 10% Testabdeckung = hohes Regressions-Risiko.</w:t>
+      </w:r>
+    </w:p>
+    <w:p>
+      <w:pPr>
+        <w:pStyle w:val="ListParagraph"/>
+        <w:numPr>
+          <w:ilvl w:val="0"/>
+          <w:numId w:val="2"/>
+        </w:numPr>
+        <w:spacing w:after="60"/>
+      </w:pPr>
+      <w:r>
+        <w:rPr>
+          <w:rFonts w:ascii="Arial" w:cs="Arial" w:eastAsia="Arial" w:hAnsi="Arial"/>
+          <w:sz w:val="22"/>
+          <w:szCs w:val="22"/>
+        </w:rPr>
+        <w:t xml:space="preserve">i18n unvollständig: 1.700+ Übersetzungen existieren, aber kein Sprachumschalter in der UI.</w:t>
       </w:r>
     </w:p>
     <w:p>
@@ -9149,7 +9232,7 @@
           <w:sz w:val="22"/>
           <w:szCs w:val="22"/>
         </w:rPr>
-        <w:t xml:space="preserve">AvyCloud ist ein technisch beeindruckendes Solo-Projekt mit einem echten Differenzierungsmerkmal (KI-Produktintelligenz) und einem bereits funktionsfähigen OMS in einem wachsenden Markt. Der aktuelle Wert liegt realistisch bei 300.000-600.000 EUR als Tech-Asset. Mit 3-4 Monaten fokussierter Entwicklung (FAKE→REAL, Self-Service, Rechnungs-Engine, Tests) und den ersten zahlenden Kunden steigt der Wert auf 600K-1,5M EUR.</w:t>
+        <w:t xml:space="preserve">AvyCloud ist ein technisch beeindruckendes Solo-Projekt mit einem echten Differenzierungsmerkmal (KI-Produktintelligenz) und einer soliden Architektur in einem wachsenden Markt. Alle Views zeigen echte Daten, das OMS existiert nativ (Default läuft noch über BaseLinker). Der aktuelle Wert liegt realistisch bei 300.000-600.000 EUR als Tech-Asset. Mit 3-4 Monaten fokussierter Entwicklung (38 Backend-Features an UI anbinden, BaseLinker ablösen, Self-Service, Tests) und den ersten zahlenden Kunden steigt der Wert auf 600K-1,5M EUR.</w:t>
       </w:r>
     </w:p>
     <w:p>
@@ -9167,7 +9250,7 @@
           <w:sz w:val="22"/>
           <w:szCs w:val="22"/>
         </w:rPr>
-        <w:t xml:space="preserve">Der schnellste Weg zum Wertanstieg: Die 12 FAKE-Views auf REAL umstellen, 5 Beta-Kunden gewinnen, und eine Seed-Runde pitchen mit dem Narrativ: "Das einzige KI-gestützte Multi-Channel-Tool für den deutschen E-Commerce – mit eigenem OMS von Order-Intake bis Tracking-Push."</w:t>
+        <w:t xml:space="preserve">Der schnellste Weg zum Wertanstieg: Die 38 ungenutzten Backend-Features sichtbar machen, BaseLinker-Abhängigkeit auflösen, 5 Beta-Kunden gewinnen, und eine Seed-Runde pitchen mit dem Narrativ: "Das einzige KI-gestützte Multi-Channel-Tool für den deutschen E-Commerce – mit eigenem OMS von Order-Intake bis Tracking-Push."</w:t>
       </w:r>
     </w:p>
     <w:sectPr>

</xml_diff>